<commit_message>
Recalculate camp costs after removing duplicate roster entry
重複削除により人数が43→42名(選手39名)に変わったため、
グラウンド使用料・交通費・コーチ費・合計金額を再計算して反映

https://claude.ai/code/session_01RP5rot342tyKxM5cH7E89T
</commit_message>
<xml_diff>
--- a/output/2026_夏合宿のご案内_修正版.docx
+++ b/output/2026_夏合宿のご案内_修正版.docx
@@ -104,8 +104,7 @@
     </w:p>
     <w:p>
       <w:r>
-        <w:lastRenderedPageBreak/>
-        <w:t>途中参加者については、参加しなかった日の宿泊・食事代は計上せず、実参加日数に応じて個別に案内・精算致します。また、途中参加により帰路のバスのみ利用する場合、交通費は帰路分（5,060円）を基準として精算致します。</w:t>
+        <w:t>途中参加者については、参加しなかった日の宿泊・食事代は計上せず、実参加日数に応じて個別に案内・精算致します。また、途中参加により帰路のバスのみ利用する場合、交通費は帰路分（5,180円）を基準として精算致します。</w:t>
       </w:r>
     </w:p>
     <w:tbl>
@@ -484,7 +483,7 @@
           </w:tcPr>
           <w:p>
             <w:r>
-              <w:t>2,310円</w:t>
+              <w:t>2,360円</w:t>
             </w:r>
           </w:p>
         </w:tc>
@@ -508,7 +507,7 @@
           </w:tcPr>
           <w:p>
             <w:r>
-              <w:t>99,000円÷43名=2,302.32円を10円単位で切り上げ</w:t>
+              <w:t>99,000円÷42名=2,357.14円を10円単位で切り上げ</w:t>
             </w:r>
           </w:p>
         </w:tc>
@@ -561,7 +560,7 @@
           </w:tcPr>
           <w:p>
             <w:r>
-              <w:t>10,240円</w:t>
+              <w:t>10,480円</w:t>
             </w:r>
           </w:p>
         </w:tc>
@@ -585,7 +584,7 @@
           </w:tcPr>
           <w:p>
             <w:r>
-              <w:t>行き222,600円÷43名＋帰り222,600円÷45名=10,235.83円を10円単位で切り上げ</w:t>
+              <w:t>行き222,600円÷42名＋帰り222,600円÷43名=10,476.74円を10円単位で切り上げ</w:t>
             </w:r>
           </w:p>
         </w:tc>
@@ -792,7 +791,7 @@
           </w:tcPr>
           <w:p>
             <w:r>
-              <w:t>77,770円</w:t>
+              <w:t>78,060円</w:t>
             </w:r>
           </w:p>
         </w:tc>
@@ -869,7 +868,7 @@
           </w:tcPr>
           <w:p>
             <w:r>
-              <w:t>1,000円</w:t>
+              <w:t>1,030円</w:t>
             </w:r>
           </w:p>
         </w:tc>
@@ -893,7 +892,7 @@
           </w:tcPr>
           <w:p>
             <w:r>
-              <w:t>外部コーチ2名分計40,000円÷選手40名=1,000円（選手のみ）</w:t>
+              <w:t>外部コーチ2名分計40,000円÷選手39名=1,025.64円を10円単位で切り上げ（選手のみ）</w:t>
             </w:r>
           </w:p>
         </w:tc>
@@ -948,7 +947,7 @@
           </w:tcPr>
           <w:p>
             <w:r>
-              <w:t>78,770円</w:t>
+              <w:t>79,090円</w:t>
             </w:r>
           </w:p>
         </w:tc>
@@ -973,7 +972,7 @@
           </w:tcPr>
           <w:p>
             <w:r>
-              <w:t>基本額77,770円＋コーチ費1,000円</w:t>
+              <w:t>基本額78,060円＋コーチ費1,030円</w:t>
             </w:r>
           </w:p>
         </w:tc>
@@ -1028,7 +1027,7 @@
           </w:tcPr>
           <w:p>
             <w:r>
-              <w:t>77,770円</w:t>
+              <w:t>78,060円</w:t>
             </w:r>
           </w:p>
         </w:tc>
@@ -1061,7 +1060,7 @@
     </w:tbl>
     <w:p>
       <w:r>
-        <w:t>※通常参加の選手は78,770円、マネージャーは77,770円です。選手については、外部コーチ2名分の謝礼・宿泊交通費計40,000円を選手40名で割った1,000円をコーチ費として加算しています。</w:t>
+        <w:t>※通常参加の選手は79,090円、マネージャーは78,060円です。選手については、外部コーチ2名分の謝礼・宿泊交通費計40,000円を選手39名で割った1,030円をコーチ費として加算しています。</w:t>
       </w:r>
     </w:p>
     <w:p>
@@ -5119,7 +5118,7 @@
     </w:p>
     <w:p>
       <w:r>
-        <w:t>顧問は宿泊費・食事代が発生しないため、グラウンド使用料は参加生徒43名で計算しています。バス代は、往路分を生徒43名、復路分を生徒43名＋顧問1名で按分しています。参加人数に変更がある場合は、最終精算時に調整します。</w:t>
+        <w:t>顧問は宿泊費・食事代が発生しないため、グラウンド使用料は参加生徒42名で計算しています。バス代は、往路分を生徒42名、復路分を生徒42名＋顧問1名（43名）で按分しています。参加人数に変更がある場合は、最終精算時に調整します。</w:t>
       </w:r>
     </w:p>
     <w:p/>

</xml_diff>